<commit_message>
includes precio in cotizacion
</commit_message>
<xml_diff>
--- a/plantilla_cotizacion.docx
+++ b/plantilla_cotizacion.docx
@@ -1,6 +1,6 @@
 
 <file path=word/document.xml><?xml version="1.0" encoding="utf-8"?>
-<w:document xmlns:wpc="http://schemas.microsoft.com/office/word/2010/wordprocessingCanvas" xmlns:cx="http://schemas.microsoft.com/office/drawing/2014/chartex" xmlns:cx1="http://schemas.microsoft.com/office/drawing/2015/9/8/chartex" xmlns:cx2="http://schemas.microsoft.com/office/drawing/2015/10/21/chartex" xmlns:cx3="http://schemas.microsoft.com/office/drawing/2016/5/9/chartex" xmlns:cx4="http://schemas.microsoft.com/office/drawing/2016/5/10/chartex" xmlns:cx5="http://schemas.microsoft.com/office/drawing/2016/5/11/chartex" xmlns:cx6="http://schemas.microsoft.com/office/drawing/2016/5/12/chartex" xmlns:cx7="http://schemas.microsoft.com/office/drawing/2016/5/13/chartex" xmlns:cx8="http://schemas.microsoft.com/office/drawing/2016/5/14/chartex" xmlns:mc="http://schemas.openxmlformats.org/markup-compatibility/2006" xmlns:aink="http://schemas.microsoft.com/office/drawing/2016/ink" xmlns:am3d="http://schemas.microsoft.com/office/drawing/2017/model3d" xmlns:o="urn:schemas-microsoft-com:office:office" xmlns:r="http://schemas.openxmlformats.org/officeDocument/2006/relationships" xmlns:m="http://schemas.openxmlformats.org/officeDocument/2006/math" xmlns:v="urn:schemas-microsoft-com:vml" xmlns:wp14="http://schemas.microsoft.com/office/word/2010/wordprocessingDrawing" xmlns:wp="http://schemas.openxmlformats.org/drawingml/2006/wordprocessingDrawing" xmlns:w10="urn:schemas-microsoft-com:office:word" xmlns:w="http://schemas.openxmlformats.org/wordprocessingml/2006/main" xmlns:w14="http://schemas.microsoft.com/office/word/2010/wordml" xmlns:w15="http://schemas.microsoft.com/office/word/2012/wordml" xmlns:w16cid="http://schemas.microsoft.com/office/word/2016/wordml/cid" xmlns:w16se="http://schemas.microsoft.com/office/word/2015/wordml/symex" xmlns:wpg="http://schemas.microsoft.com/office/word/2010/wordprocessingGroup" xmlns:wpi="http://schemas.microsoft.com/office/word/2010/wordprocessingInk" xmlns:wne="http://schemas.microsoft.com/office/word/2006/wordml" xmlns:wps="http://schemas.microsoft.com/office/word/2010/wordprocessingShape" mc:Ignorable="w14 w15 w16se w16cid wp14">
+<w:document xmlns:wpc="http://schemas.microsoft.com/office/word/2010/wordprocessingCanvas" xmlns:cx="http://schemas.microsoft.com/office/drawing/2014/chartex" xmlns:cx1="http://schemas.microsoft.com/office/drawing/2015/9/8/chartex" xmlns:cx2="http://schemas.microsoft.com/office/drawing/2015/10/21/chartex" xmlns:cx3="http://schemas.microsoft.com/office/drawing/2016/5/9/chartex" xmlns:cx4="http://schemas.microsoft.com/office/drawing/2016/5/10/chartex" xmlns:cx5="http://schemas.microsoft.com/office/drawing/2016/5/11/chartex" xmlns:cx6="http://schemas.microsoft.com/office/drawing/2016/5/12/chartex" xmlns:cx7="http://schemas.microsoft.com/office/drawing/2016/5/13/chartex" xmlns:cx8="http://schemas.microsoft.com/office/drawing/2016/5/14/chartex" xmlns:mc="http://schemas.openxmlformats.org/markup-compatibility/2006" xmlns:aink="http://schemas.microsoft.com/office/drawing/2016/ink" xmlns:am3d="http://schemas.microsoft.com/office/drawing/2017/model3d" xmlns:o="urn:schemas-microsoft-com:office:office" xmlns:r="http://schemas.openxmlformats.org/officeDocument/2006/relationships" xmlns:m="http://schemas.openxmlformats.org/officeDocument/2006/math" xmlns:v="urn:schemas-microsoft-com:vml" xmlns:wp14="http://schemas.microsoft.com/office/word/2010/wordprocessingDrawing" xmlns:wp="http://schemas.openxmlformats.org/drawingml/2006/wordprocessingDrawing" xmlns:w10="urn:schemas-microsoft-com:office:word" xmlns:w="http://schemas.openxmlformats.org/wordprocessingml/2006/main" xmlns:w14="http://schemas.microsoft.com/office/word/2010/wordml" xmlns:w15="http://schemas.microsoft.com/office/word/2012/wordml" xmlns:w16cex="http://schemas.microsoft.com/office/word/2018/wordml/cex" xmlns:w16cid="http://schemas.microsoft.com/office/word/2016/wordml/cid" xmlns:w16="http://schemas.microsoft.com/office/word/2018/wordml" xmlns:w16sdtdh="http://schemas.microsoft.com/office/word/2020/wordml/sdtdatahash" xmlns:w16se="http://schemas.microsoft.com/office/word/2015/wordml/symex" xmlns:wpg="http://schemas.microsoft.com/office/word/2010/wordprocessingGroup" xmlns:wpi="http://schemas.microsoft.com/office/word/2010/wordprocessingInk" xmlns:wne="http://schemas.microsoft.com/office/word/2006/wordml" xmlns:wps="http://schemas.microsoft.com/office/word/2010/wordprocessingShape" mc:Ignorable="w14 w15 w16se w16cid w16 w16cex w16sdtdh wp14">
   <w:body>
     <w:tbl>
       <w:tblPr>
@@ -153,7 +153,161 @@
         </w:tc>
       </w:tr>
     </w:tbl>
-    <w:p/>
+    <w:p>
+      <w:r>
+        <w:rPr>
+          <w:noProof/>
+        </w:rPr>
+        <mc:AlternateContent>
+          <mc:Choice Requires="wpg">
+            <w:drawing>
+              <wp:anchor distT="0" distB="0" distL="114300" distR="114300" simplePos="0" relativeHeight="251661312" behindDoc="1" locked="0" layoutInCell="1" allowOverlap="1" wp14:anchorId="1D89D65A" wp14:editId="3FF42CEE">
+                <wp:simplePos x="0" y="0"/>
+                <wp:positionH relativeFrom="column">
+                  <wp:posOffset>-685800</wp:posOffset>
+                </wp:positionH>
+                <wp:positionV relativeFrom="paragraph">
+                  <wp:posOffset>-1593850</wp:posOffset>
+                </wp:positionV>
+                <wp:extent cx="7772400" cy="10570845"/>
+                <wp:effectExtent l="0" t="0" r="0" b="1905"/>
+                <wp:wrapNone/>
+                <wp:docPr id="12" name="Grupo 12"/>
+                <wp:cNvGraphicFramePr/>
+                <a:graphic xmlns:a="http://schemas.openxmlformats.org/drawingml/2006/main">
+                  <a:graphicData uri="http://schemas.microsoft.com/office/word/2010/wordprocessingGroup">
+                    <wpg:wgp>
+                      <wpg:cNvGrpSpPr/>
+                      <wpg:grpSpPr>
+                        <a:xfrm>
+                          <a:off x="0" y="0"/>
+                          <a:ext cx="7772400" cy="10570845"/>
+                          <a:chOff x="0" y="0"/>
+                          <a:chExt cx="7772400" cy="10570845"/>
+                        </a:xfrm>
+                      </wpg:grpSpPr>
+                      <pic:pic xmlns:pic="http://schemas.openxmlformats.org/drawingml/2006/picture">
+                        <pic:nvPicPr>
+                          <pic:cNvPr id="2" name="Image 2" descr="Texto  Descripción generada automáticamente con confianza media"/>
+                          <pic:cNvPicPr/>
+                        </pic:nvPicPr>
+                        <pic:blipFill>
+                          <a:blip r:embed="rId7" cstate="print"/>
+                          <a:stretch>
+                            <a:fillRect/>
+                          </a:stretch>
+                        </pic:blipFill>
+                        <pic:spPr>
+                          <a:xfrm>
+                            <a:off x="0" y="7620"/>
+                            <a:ext cx="7772400" cy="10563225"/>
+                          </a:xfrm>
+                          <a:prstGeom prst="rect">
+                            <a:avLst/>
+                          </a:prstGeom>
+                        </pic:spPr>
+                      </pic:pic>
+                      <wpg:grpSp>
+                        <wpg:cNvPr id="1" name="Group 1"/>
+                        <wpg:cNvGrpSpPr>
+                          <a:grpSpLocks/>
+                        </wpg:cNvGrpSpPr>
+                        <wpg:grpSpPr>
+                          <a:xfrm>
+                            <a:off x="198120" y="0"/>
+                            <a:ext cx="7284974" cy="768426"/>
+                            <a:chOff x="208279" y="42760"/>
+                            <a:chExt cx="7284974" cy="725716"/>
+                          </a:xfrm>
+                        </wpg:grpSpPr>
+                        <pic:pic xmlns:pic="http://schemas.openxmlformats.org/drawingml/2006/picture">
+                          <pic:nvPicPr>
+                            <pic:cNvPr id="3" name="Image 3"/>
+                            <pic:cNvPicPr/>
+                          </pic:nvPicPr>
+                          <pic:blipFill>
+                            <a:blip r:embed="rId8" cstate="print"/>
+                            <a:stretch>
+                              <a:fillRect/>
+                            </a:stretch>
+                          </pic:blipFill>
+                          <pic:spPr>
+                            <a:xfrm>
+                              <a:off x="5838825" y="42760"/>
+                              <a:ext cx="1654428" cy="720001"/>
+                            </a:xfrm>
+                            <a:prstGeom prst="rect">
+                              <a:avLst/>
+                            </a:prstGeom>
+                          </pic:spPr>
+                        </pic:pic>
+                        <pic:pic xmlns:pic="http://schemas.openxmlformats.org/drawingml/2006/picture">
+                          <pic:nvPicPr>
+                            <pic:cNvPr id="4" name="Image 4"/>
+                            <pic:cNvPicPr/>
+                          </pic:nvPicPr>
+                          <pic:blipFill>
+                            <a:blip r:embed="rId9" cstate="print"/>
+                            <a:stretch>
+                              <a:fillRect/>
+                            </a:stretch>
+                          </pic:blipFill>
+                          <pic:spPr>
+                            <a:xfrm>
+                              <a:off x="208279" y="48475"/>
+                              <a:ext cx="1199997" cy="720001"/>
+                            </a:xfrm>
+                            <a:prstGeom prst="rect">
+                              <a:avLst/>
+                            </a:prstGeom>
+                          </pic:spPr>
+                        </pic:pic>
+                      </wpg:grpSp>
+                    </wpg:wgp>
+                  </a:graphicData>
+                </a:graphic>
+              </wp:anchor>
+            </w:drawing>
+          </mc:Choice>
+          <mc:Fallback>
+            <w:pict>
+              <v:group w14:anchorId="0BCACCC5" id="Grupo 12" o:spid="_x0000_s1026" style="position:absolute;margin-left:-54pt;margin-top:-125.5pt;width:612pt;height:832.35pt;z-index:-251655168" coordsize="77724,105708" o:gfxdata="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">
+                <v:shapetype id="_x0000_t75" coordsize="21600,21600" o:spt="75" o:preferrelative="t" path="m@4@5l@4@11@9@11@9@5xe" filled="f" stroked="f">
+                  <v:stroke joinstyle="miter"/>
+                  <v:formulas>
+                    <v:f eqn="if lineDrawn pixelLineWidth 0"/>
+                    <v:f eqn="sum @0 1 0"/>
+                    <v:f eqn="sum 0 0 @1"/>
+                    <v:f eqn="prod @2 1 2"/>
+                    <v:f eqn="prod @3 21600 pixelWidth"/>
+                    <v:f eqn="prod @3 21600 pixelHeight"/>
+                    <v:f eqn="sum @0 0 1"/>
+                    <v:f eqn="prod @6 1 2"/>
+                    <v:f eqn="prod @7 21600 pixelWidth"/>
+                    <v:f eqn="sum @8 21600 0"/>
+                    <v:f eqn="prod @7 21600 pixelHeight"/>
+                    <v:f eqn="sum @10 21600 0"/>
+                  </v:formulas>
+                  <v:path o:extrusionok="f" gradientshapeok="t" o:connecttype="rect"/>
+                  <o:lock v:ext="edit" aspectratio="t"/>
+                </v:shapetype>
+                <v:shape id="Image 2" o:spid="_x0000_s1027" type="#_x0000_t75" alt="Texto  Descripción generada automáticamente con confianza media" style="position:absolute;top:76;width:77724;height:105632;visibility:visible;mso-wrap-style:square" o:gfxdata="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">
+                  <v:imagedata r:id="rId10" o:title="Texto  Descripción generada automáticamente con confianza media"/>
+                </v:shape>
+                <v:group id="Group 1" o:spid="_x0000_s1028" style="position:absolute;left:1981;width:72849;height:7684" coordorigin="2082,427" coordsize="72849,7257" o:gfxdata="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">
+                  <v:shape id="Image 3" o:spid="_x0000_s1029" type="#_x0000_t75" style="position:absolute;left:58388;top:427;width:16544;height:7200;visibility:visible;mso-wrap-style:square" o:gfxdata="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">
+                    <v:imagedata r:id="rId11" o:title=""/>
+                  </v:shape>
+                  <v:shape id="Image 4" o:spid="_x0000_s1030" type="#_x0000_t75" style="position:absolute;left:2082;top:484;width:12000;height:7200;visibility:visible;mso-wrap-style:square" o:gfxdata="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">
+                    <v:imagedata r:id="rId12" o:title=""/>
+                  </v:shape>
+                </v:group>
+              </v:group>
+            </w:pict>
+          </mc:Fallback>
+        </mc:AlternateContent>
+      </w:r>
+    </w:p>
     <w:p/>
     <w:tbl>
       <w:tblPr>
@@ -2641,7 +2795,162 @@
       </w:tr>
     </w:tbl>
     <w:p/>
-    <w:p/>
+    <w:p>
+      <w:r>
+        <w:rPr>
+          <w:rFonts w:ascii="Arial" w:hAnsi="Arial" w:cs="Arial"/>
+          <w:b/>
+          <w:noProof/>
+        </w:rPr>
+        <w:lastRenderedPageBreak/>
+        <mc:AlternateContent>
+          <mc:Choice Requires="wpg">
+            <w:drawing>
+              <wp:anchor distT="0" distB="0" distL="0" distR="0" simplePos="0" relativeHeight="251665408" behindDoc="1" locked="0" layoutInCell="1" allowOverlap="1" wp14:anchorId="4C94BA1E" wp14:editId="00B4FBAD">
+                <wp:simplePos x="0" y="0"/>
+                <wp:positionH relativeFrom="page">
+                  <wp:posOffset>0</wp:posOffset>
+                </wp:positionH>
+                <wp:positionV relativeFrom="page">
+                  <wp:posOffset>0</wp:posOffset>
+                </wp:positionV>
+                <wp:extent cx="7284974" cy="768426"/>
+                <wp:effectExtent l="0" t="0" r="0" b="0"/>
+                <wp:wrapNone/>
+                <wp:docPr id="6" name="Group 1"/>
+                <wp:cNvGraphicFramePr>
+                  <a:graphicFrameLocks xmlns:a="http://schemas.openxmlformats.org/drawingml/2006/main"/>
+                </wp:cNvGraphicFramePr>
+                <a:graphic xmlns:a="http://schemas.openxmlformats.org/drawingml/2006/main">
+                  <a:graphicData uri="http://schemas.microsoft.com/office/word/2010/wordprocessingGroup">
+                    <wpg:wgp>
+                      <wpg:cNvGrpSpPr>
+                        <a:grpSpLocks/>
+                      </wpg:cNvGrpSpPr>
+                      <wpg:grpSpPr>
+                        <a:xfrm>
+                          <a:off x="0" y="0"/>
+                          <a:ext cx="7284974" cy="768426"/>
+                          <a:chOff x="208279" y="42760"/>
+                          <a:chExt cx="7284974" cy="725716"/>
+                        </a:xfrm>
+                      </wpg:grpSpPr>
+                      <pic:pic xmlns:pic="http://schemas.openxmlformats.org/drawingml/2006/picture">
+                        <pic:nvPicPr>
+                          <pic:cNvPr id="7" name="Image 3"/>
+                          <pic:cNvPicPr/>
+                        </pic:nvPicPr>
+                        <pic:blipFill>
+                          <a:blip r:embed="rId8" cstate="print"/>
+                          <a:stretch>
+                            <a:fillRect/>
+                          </a:stretch>
+                        </pic:blipFill>
+                        <pic:spPr>
+                          <a:xfrm>
+                            <a:off x="5838825" y="42760"/>
+                            <a:ext cx="1654428" cy="720001"/>
+                          </a:xfrm>
+                          <a:prstGeom prst="rect">
+                            <a:avLst/>
+                          </a:prstGeom>
+                        </pic:spPr>
+                      </pic:pic>
+                      <pic:pic xmlns:pic="http://schemas.openxmlformats.org/drawingml/2006/picture">
+                        <pic:nvPicPr>
+                          <pic:cNvPr id="8" name="Image 4"/>
+                          <pic:cNvPicPr/>
+                        </pic:nvPicPr>
+                        <pic:blipFill>
+                          <a:blip r:embed="rId9" cstate="print"/>
+                          <a:stretch>
+                            <a:fillRect/>
+                          </a:stretch>
+                        </pic:blipFill>
+                        <pic:spPr>
+                          <a:xfrm>
+                            <a:off x="208279" y="48475"/>
+                            <a:ext cx="1199997" cy="720001"/>
+                          </a:xfrm>
+                          <a:prstGeom prst="rect">
+                            <a:avLst/>
+                          </a:prstGeom>
+                        </pic:spPr>
+                      </pic:pic>
+                    </wpg:wgp>
+                  </a:graphicData>
+                </a:graphic>
+                <wp14:sizeRelH relativeFrom="margin">
+                  <wp14:pctWidth>0</wp14:pctWidth>
+                </wp14:sizeRelH>
+                <wp14:sizeRelV relativeFrom="margin">
+                  <wp14:pctHeight>0</wp14:pctHeight>
+                </wp14:sizeRelV>
+              </wp:anchor>
+            </w:drawing>
+          </mc:Choice>
+          <mc:Fallback>
+            <w:pict>
+              <v:group w14:anchorId="129A64AE" id="Group 1" o:spid="_x0000_s1026" style="position:absolute;margin-left:0;margin-top:0;width:573.6pt;height:60.5pt;z-index:-251651072;mso-wrap-distance-left:0;mso-wrap-distance-right:0;mso-position-horizontal-relative:page;mso-position-vertical-relative:page;mso-width-relative:margin;mso-height-relative:margin" coordorigin="2082,427" coordsize="72849,7257" o:gfxdata="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">
+                <v:shape id="Image 3" o:spid="_x0000_s1027" type="#_x0000_t75" style="position:absolute;left:58388;top:427;width:16544;height:7200;visibility:visible;mso-wrap-style:square" o:gfxdata="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">
+                  <v:imagedata r:id="rId11" o:title=""/>
+                </v:shape>
+                <v:shape id="Image 4" o:spid="_x0000_s1028" type="#_x0000_t75" style="position:absolute;left:2082;top:484;width:12000;height:7200;visibility:visible;mso-wrap-style:square" o:gfxdata="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">
+                  <v:imagedata r:id="rId12" o:title=""/>
+                </v:shape>
+                <w10:wrap anchorx="page" anchory="page"/>
+              </v:group>
+            </w:pict>
+          </mc:Fallback>
+        </mc:AlternateContent>
+      </w:r>
+      <w:r>
+        <w:rPr>
+          <w:noProof/>
+        </w:rPr>
+        <w:drawing>
+          <wp:anchor distT="0" distB="0" distL="114300" distR="114300" simplePos="0" relativeHeight="251663360" behindDoc="1" locked="0" layoutInCell="1" allowOverlap="1" wp14:anchorId="3ADB5FB6" wp14:editId="377D4405">
+            <wp:simplePos x="0" y="0"/>
+            <wp:positionH relativeFrom="page">
+              <wp:align>right</wp:align>
+            </wp:positionH>
+            <wp:positionV relativeFrom="paragraph">
+              <wp:posOffset>-738505</wp:posOffset>
+            </wp:positionV>
+            <wp:extent cx="7772400" cy="10563225"/>
+            <wp:effectExtent l="0" t="0" r="0" b="9525"/>
+            <wp:wrapNone/>
+            <wp:docPr id="5" name="Image 2" descr="Texto  Descripción generada automáticamente con confianza media"/>
+            <wp:cNvGraphicFramePr/>
+            <a:graphic xmlns:a="http://schemas.openxmlformats.org/drawingml/2006/main">
+              <a:graphicData uri="http://schemas.openxmlformats.org/drawingml/2006/picture">
+                <pic:pic xmlns:pic="http://schemas.openxmlformats.org/drawingml/2006/picture">
+                  <pic:nvPicPr>
+                    <pic:cNvPr id="2" name="Image 2" descr="Texto  Descripción generada automáticamente con confianza media"/>
+                    <pic:cNvPicPr/>
+                  </pic:nvPicPr>
+                  <pic:blipFill>
+                    <a:blip r:embed="rId7" cstate="print"/>
+                    <a:stretch>
+                      <a:fillRect/>
+                    </a:stretch>
+                  </pic:blipFill>
+                  <pic:spPr>
+                    <a:xfrm>
+                      <a:off x="0" y="0"/>
+                      <a:ext cx="7772400" cy="10563225"/>
+                    </a:xfrm>
+                    <a:prstGeom prst="rect">
+                      <a:avLst/>
+                    </a:prstGeom>
+                  </pic:spPr>
+                </pic:pic>
+              </a:graphicData>
+            </a:graphic>
+          </wp:anchor>
+        </w:drawing>
+      </w:r>
+    </w:p>
     <w:p/>
     <w:tbl>
       <w:tblPr>
@@ -2803,29 +3112,27 @@
                 <w:sz w:val="19"/>
                 <w:szCs w:val="19"/>
               </w:rPr>
-              <w:t>Datos para dep</w:t>
-            </w:r>
-            <w:r>
-              <w:rPr>
-                <w:rFonts w:ascii="Arial" w:eastAsia="Arial" w:hAnsi="Arial" w:cs="Arial"/>
-                <w:b/>
-                <w:bCs/>
-                <w:color w:val="003366"/>
+              <w:t>Datos para depósito / transferencia:</w:t>
+            </w:r>
+          </w:p>
+          <w:p>
+            <w:r>
+              <w:rPr>
+                <w:rFonts w:ascii="Arial" w:eastAsia="Arial" w:hAnsi="Arial" w:cs="Arial"/>
                 <w:sz w:val="19"/>
                 <w:szCs w:val="19"/>
               </w:rPr>
-              <w:t>ó</w:t>
-            </w:r>
-            <w:r>
-              <w:rPr>
-                <w:rFonts w:ascii="Arial" w:eastAsia="Arial" w:hAnsi="Arial" w:cs="Arial"/>
-                <w:b/>
-                <w:bCs/>
-                <w:color w:val="003366"/>
+              <w:t>Proyecto: Venta de Servicios Laboratorio de Topografía, Suelos y Materiales</w:t>
+            </w:r>
+          </w:p>
+          <w:p>
+            <w:r>
+              <w:rPr>
+                <w:rFonts w:ascii="Arial" w:eastAsia="Arial" w:hAnsi="Arial" w:cs="Arial"/>
                 <w:sz w:val="19"/>
                 <w:szCs w:val="19"/>
               </w:rPr>
-              <w:t>sito / transferencia:</w:t>
+              <w:t>Banco: BAC</w:t>
             </w:r>
           </w:p>
           <w:p>
@@ -2835,69 +3142,17 @@
                 <w:sz w:val="19"/>
                 <w:szCs w:val="19"/>
               </w:rPr>
-              <w:t>Proyecto: Venta de Servicios Laboratorio de Topograf</w:t>
-            </w:r>
+              <w:t>No. de Cuenta: 730522021</w:t>
+            </w:r>
+          </w:p>
+          <w:p>
             <w:r>
               <w:rPr>
                 <w:rFonts w:ascii="Arial" w:eastAsia="Arial" w:hAnsi="Arial" w:cs="Arial"/>
                 <w:sz w:val="19"/>
                 <w:szCs w:val="19"/>
               </w:rPr>
-              <w:t>í</w:t>
-            </w:r>
-            <w:r>
-              <w:rPr>
-                <w:rFonts w:ascii="Arial" w:eastAsia="Arial" w:hAnsi="Arial" w:cs="Arial"/>
-                <w:sz w:val="19"/>
-                <w:szCs w:val="19"/>
-              </w:rPr>
-              <w:t>a, Suelos y Materiales</w:t>
-            </w:r>
-          </w:p>
-          <w:p>
-            <w:r>
-              <w:rPr>
-                <w:rFonts w:ascii="Arial" w:eastAsia="Arial" w:hAnsi="Arial" w:cs="Arial"/>
-                <w:sz w:val="19"/>
-                <w:szCs w:val="19"/>
-              </w:rPr>
-              <w:t>Banco: BAC</w:t>
-            </w:r>
-          </w:p>
-          <w:p>
-            <w:r>
-              <w:rPr>
-                <w:rFonts w:ascii="Arial" w:eastAsia="Arial" w:hAnsi="Arial" w:cs="Arial"/>
-                <w:sz w:val="19"/>
-                <w:szCs w:val="19"/>
-              </w:rPr>
-              <w:t>No. de Cuenta: 730522021</w:t>
-            </w:r>
-          </w:p>
-          <w:p>
-            <w:r>
-              <w:rPr>
-                <w:rFonts w:ascii="Arial" w:eastAsia="Arial" w:hAnsi="Arial" w:cs="Arial"/>
-                <w:sz w:val="19"/>
-                <w:szCs w:val="19"/>
-              </w:rPr>
-              <w:t>Tipo: Cheques</w:t>
-            </w:r>
-            <w:r>
-              <w:rPr>
-                <w:rFonts w:ascii="Arial" w:eastAsia="Arial" w:hAnsi="Arial" w:cs="Arial"/>
-                <w:sz w:val="19"/>
-                <w:szCs w:val="19"/>
-              </w:rPr>
-              <w:t xml:space="preserve"> - </w:t>
-            </w:r>
-            <w:r>
-              <w:rPr>
-                <w:rFonts w:ascii="Arial" w:eastAsia="Arial" w:hAnsi="Arial" w:cs="Arial"/>
-                <w:sz w:val="19"/>
-                <w:szCs w:val="19"/>
-              </w:rPr>
-              <w:t>HNL</w:t>
+              <w:t>Tipo: Cheques - HNL</w:t>
             </w:r>
           </w:p>
         </w:tc>
@@ -3198,13 +3453,10 @@
         </w:tc>
       </w:tr>
     </w:tbl>
-    <w:p>
-      <w:bookmarkStart w:id="0" w:name="_GoBack"/>
-      <w:bookmarkEnd w:id="0"/>
-    </w:p>
+    <w:p/>
     <w:sectPr>
-      <w:headerReference w:type="default" r:id="rId7"/>
-      <w:footerReference w:type="default" r:id="rId8"/>
+      <w:headerReference w:type="default" r:id="rId13"/>
+      <w:footerReference w:type="default" r:id="rId14"/>
       <w:pgSz w:w="12240" w:h="15840"/>
       <w:pgMar w:top="1000" w:right="1080" w:bottom="1000" w:left="1080" w:header="708" w:footer="708" w:gutter="0"/>
       <w:cols w:space="720"/>
@@ -3215,7 +3467,7 @@
 </file>
 
 <file path=word/endnotes.xml><?xml version="1.0" encoding="utf-8"?>
-<w:endnotes xmlns:wpc="http://schemas.microsoft.com/office/word/2010/wordprocessingCanvas" xmlns:cx="http://schemas.microsoft.com/office/drawing/2014/chartex" xmlns:cx1="http://schemas.microsoft.com/office/drawing/2015/9/8/chartex" xmlns:cx2="http://schemas.microsoft.com/office/drawing/2015/10/21/chartex" xmlns:cx3="http://schemas.microsoft.com/office/drawing/2016/5/9/chartex" xmlns:cx4="http://schemas.microsoft.com/office/drawing/2016/5/10/chartex" xmlns:cx5="http://schemas.microsoft.com/office/drawing/2016/5/11/chartex" xmlns:cx6="http://schemas.microsoft.com/office/drawing/2016/5/12/chartex" xmlns:cx7="http://schemas.microsoft.com/office/drawing/2016/5/13/chartex" xmlns:cx8="http://schemas.microsoft.com/office/drawing/2016/5/14/chartex" xmlns:mc="http://schemas.openxmlformats.org/markup-compatibility/2006" xmlns:aink="http://schemas.microsoft.com/office/drawing/2016/ink" xmlns:am3d="http://schemas.microsoft.com/office/drawing/2017/model3d" xmlns:o="urn:schemas-microsoft-com:office:office" xmlns:r="http://schemas.openxmlformats.org/officeDocument/2006/relationships" xmlns:m="http://schemas.openxmlformats.org/officeDocument/2006/math" xmlns:v="urn:schemas-microsoft-com:vml" xmlns:wp14="http://schemas.microsoft.com/office/word/2010/wordprocessingDrawing" xmlns:wp="http://schemas.openxmlformats.org/drawingml/2006/wordprocessingDrawing" xmlns:w10="urn:schemas-microsoft-com:office:word" xmlns:w="http://schemas.openxmlformats.org/wordprocessingml/2006/main" xmlns:w14="http://schemas.microsoft.com/office/word/2010/wordml" xmlns:w15="http://schemas.microsoft.com/office/word/2012/wordml" xmlns:w16cid="http://schemas.microsoft.com/office/word/2016/wordml/cid" xmlns:w16se="http://schemas.microsoft.com/office/word/2015/wordml/symex" xmlns:wpg="http://schemas.microsoft.com/office/word/2010/wordprocessingGroup" xmlns:wpi="http://schemas.microsoft.com/office/word/2010/wordprocessingInk" xmlns:wne="http://schemas.microsoft.com/office/word/2006/wordml" xmlns:wps="http://schemas.microsoft.com/office/word/2010/wordprocessingShape" mc:Ignorable="w14 w15 w16se w16cid wp14">
+<w:endnotes xmlns:wpc="http://schemas.microsoft.com/office/word/2010/wordprocessingCanvas" xmlns:cx="http://schemas.microsoft.com/office/drawing/2014/chartex" xmlns:cx1="http://schemas.microsoft.com/office/drawing/2015/9/8/chartex" xmlns:cx2="http://schemas.microsoft.com/office/drawing/2015/10/21/chartex" xmlns:cx3="http://schemas.microsoft.com/office/drawing/2016/5/9/chartex" xmlns:cx4="http://schemas.microsoft.com/office/drawing/2016/5/10/chartex" xmlns:cx5="http://schemas.microsoft.com/office/drawing/2016/5/11/chartex" xmlns:cx6="http://schemas.microsoft.com/office/drawing/2016/5/12/chartex" xmlns:cx7="http://schemas.microsoft.com/office/drawing/2016/5/13/chartex" xmlns:cx8="http://schemas.microsoft.com/office/drawing/2016/5/14/chartex" xmlns:mc="http://schemas.openxmlformats.org/markup-compatibility/2006" xmlns:aink="http://schemas.microsoft.com/office/drawing/2016/ink" xmlns:am3d="http://schemas.microsoft.com/office/drawing/2017/model3d" xmlns:o="urn:schemas-microsoft-com:office:office" xmlns:r="http://schemas.openxmlformats.org/officeDocument/2006/relationships" xmlns:m="http://schemas.openxmlformats.org/officeDocument/2006/math" xmlns:v="urn:schemas-microsoft-com:vml" xmlns:wp14="http://schemas.microsoft.com/office/word/2010/wordprocessingDrawing" xmlns:wp="http://schemas.openxmlformats.org/drawingml/2006/wordprocessingDrawing" xmlns:w10="urn:schemas-microsoft-com:office:word" xmlns:w="http://schemas.openxmlformats.org/wordprocessingml/2006/main" xmlns:w14="http://schemas.microsoft.com/office/word/2010/wordml" xmlns:w15="http://schemas.microsoft.com/office/word/2012/wordml" xmlns:w16cex="http://schemas.microsoft.com/office/word/2018/wordml/cex" xmlns:w16cid="http://schemas.microsoft.com/office/word/2016/wordml/cid" xmlns:w16="http://schemas.microsoft.com/office/word/2018/wordml" xmlns:w16sdtdh="http://schemas.microsoft.com/office/word/2020/wordml/sdtdatahash" xmlns:w16se="http://schemas.microsoft.com/office/word/2015/wordml/symex" xmlns:wpg="http://schemas.microsoft.com/office/word/2010/wordprocessingGroup" xmlns:wpi="http://schemas.microsoft.com/office/word/2010/wordprocessingInk" xmlns:wne="http://schemas.microsoft.com/office/word/2006/wordml" xmlns:wps="http://schemas.microsoft.com/office/word/2010/wordprocessingShape" mc:Ignorable="w14 w15 w16se w16cid w16 w16cex w16sdtdh wp14">
   <w:endnote w:type="separator" w:id="-1">
     <w:p>
       <w:r>
@@ -3234,7 +3486,7 @@
 </file>
 
 <file path=word/footer1.xml><?xml version="1.0" encoding="utf-8"?>
-<w:ftr xmlns:wpc="http://schemas.microsoft.com/office/word/2010/wordprocessingCanvas" xmlns:cx="http://schemas.microsoft.com/office/drawing/2014/chartex" xmlns:cx1="http://schemas.microsoft.com/office/drawing/2015/9/8/chartex" xmlns:cx2="http://schemas.microsoft.com/office/drawing/2015/10/21/chartex" xmlns:cx3="http://schemas.microsoft.com/office/drawing/2016/5/9/chartex" xmlns:cx4="http://schemas.microsoft.com/office/drawing/2016/5/10/chartex" xmlns:cx5="http://schemas.microsoft.com/office/drawing/2016/5/11/chartex" xmlns:cx6="http://schemas.microsoft.com/office/drawing/2016/5/12/chartex" xmlns:cx7="http://schemas.microsoft.com/office/drawing/2016/5/13/chartex" xmlns:cx8="http://schemas.microsoft.com/office/drawing/2016/5/14/chartex" xmlns:mc="http://schemas.openxmlformats.org/markup-compatibility/2006" xmlns:aink="http://schemas.microsoft.com/office/drawing/2016/ink" xmlns:am3d="http://schemas.microsoft.com/office/drawing/2017/model3d" xmlns:o="urn:schemas-microsoft-com:office:office" xmlns:r="http://schemas.openxmlformats.org/officeDocument/2006/relationships" xmlns:m="http://schemas.openxmlformats.org/officeDocument/2006/math" xmlns:v="urn:schemas-microsoft-com:vml" xmlns:wp14="http://schemas.microsoft.com/office/word/2010/wordprocessingDrawing" xmlns:wp="http://schemas.openxmlformats.org/drawingml/2006/wordprocessingDrawing" xmlns:w10="urn:schemas-microsoft-com:office:word" xmlns:w="http://schemas.openxmlformats.org/wordprocessingml/2006/main" xmlns:w14="http://schemas.microsoft.com/office/word/2010/wordml" xmlns:w15="http://schemas.microsoft.com/office/word/2012/wordml" xmlns:w16cid="http://schemas.microsoft.com/office/word/2016/wordml/cid" xmlns:w16se="http://schemas.microsoft.com/office/word/2015/wordml/symex" xmlns:wpg="http://schemas.microsoft.com/office/word/2010/wordprocessingGroup" xmlns:wpi="http://schemas.microsoft.com/office/word/2010/wordprocessingInk" xmlns:wne="http://schemas.microsoft.com/office/word/2006/wordml" xmlns:wps="http://schemas.microsoft.com/office/word/2010/wordprocessingShape" mc:Ignorable="w14 w15 w16se w16cid wp14">
+<w:ftr xmlns:wpc="http://schemas.microsoft.com/office/word/2010/wordprocessingCanvas" xmlns:cx="http://schemas.microsoft.com/office/drawing/2014/chartex" xmlns:cx1="http://schemas.microsoft.com/office/drawing/2015/9/8/chartex" xmlns:cx2="http://schemas.microsoft.com/office/drawing/2015/10/21/chartex" xmlns:cx3="http://schemas.microsoft.com/office/drawing/2016/5/9/chartex" xmlns:cx4="http://schemas.microsoft.com/office/drawing/2016/5/10/chartex" xmlns:cx5="http://schemas.microsoft.com/office/drawing/2016/5/11/chartex" xmlns:cx6="http://schemas.microsoft.com/office/drawing/2016/5/12/chartex" xmlns:cx7="http://schemas.microsoft.com/office/drawing/2016/5/13/chartex" xmlns:cx8="http://schemas.microsoft.com/office/drawing/2016/5/14/chartex" xmlns:mc="http://schemas.openxmlformats.org/markup-compatibility/2006" xmlns:aink="http://schemas.microsoft.com/office/drawing/2016/ink" xmlns:am3d="http://schemas.microsoft.com/office/drawing/2017/model3d" xmlns:o="urn:schemas-microsoft-com:office:office" xmlns:r="http://schemas.openxmlformats.org/officeDocument/2006/relationships" xmlns:m="http://schemas.openxmlformats.org/officeDocument/2006/math" xmlns:v="urn:schemas-microsoft-com:vml" xmlns:wp14="http://schemas.microsoft.com/office/word/2010/wordprocessingDrawing" xmlns:wp="http://schemas.openxmlformats.org/drawingml/2006/wordprocessingDrawing" xmlns:w10="urn:schemas-microsoft-com:office:word" xmlns:w="http://schemas.openxmlformats.org/wordprocessingml/2006/main" xmlns:w14="http://schemas.microsoft.com/office/word/2010/wordml" xmlns:w15="http://schemas.microsoft.com/office/word/2012/wordml" xmlns:w16cex="http://schemas.microsoft.com/office/word/2018/wordml/cex" xmlns:w16cid="http://schemas.microsoft.com/office/word/2016/wordml/cid" xmlns:w16="http://schemas.microsoft.com/office/word/2018/wordml" xmlns:w16sdtdh="http://schemas.microsoft.com/office/word/2020/wordml/sdtdatahash" xmlns:w16se="http://schemas.microsoft.com/office/word/2015/wordml/symex" xmlns:wpg="http://schemas.microsoft.com/office/word/2010/wordprocessingGroup" xmlns:wpi="http://schemas.microsoft.com/office/word/2010/wordprocessingInk" xmlns:wne="http://schemas.microsoft.com/office/word/2006/wordml" xmlns:wps="http://schemas.microsoft.com/office/word/2010/wordprocessingShape" mc:Ignorable="w14 w15 w16se w16cid w16 w16cex w16sdtdh wp14">
   <w:p>
     <w:pPr>
       <w:pBdr>
@@ -3341,7 +3593,7 @@
 </file>
 
 <file path=word/footnotes.xml><?xml version="1.0" encoding="utf-8"?>
-<w:footnotes xmlns:wpc="http://schemas.microsoft.com/office/word/2010/wordprocessingCanvas" xmlns:cx="http://schemas.microsoft.com/office/drawing/2014/chartex" xmlns:cx1="http://schemas.microsoft.com/office/drawing/2015/9/8/chartex" xmlns:cx2="http://schemas.microsoft.com/office/drawing/2015/10/21/chartex" xmlns:cx3="http://schemas.microsoft.com/office/drawing/2016/5/9/chartex" xmlns:cx4="http://schemas.microsoft.com/office/drawing/2016/5/10/chartex" xmlns:cx5="http://schemas.microsoft.com/office/drawing/2016/5/11/chartex" xmlns:cx6="http://schemas.microsoft.com/office/drawing/2016/5/12/chartex" xmlns:cx7="http://schemas.microsoft.com/office/drawing/2016/5/13/chartex" xmlns:cx8="http://schemas.microsoft.com/office/drawing/2016/5/14/chartex" xmlns:mc="http://schemas.openxmlformats.org/markup-compatibility/2006" xmlns:aink="http://schemas.microsoft.com/office/drawing/2016/ink" xmlns:am3d="http://schemas.microsoft.com/office/drawing/2017/model3d" xmlns:o="urn:schemas-microsoft-com:office:office" xmlns:r="http://schemas.openxmlformats.org/officeDocument/2006/relationships" xmlns:m="http://schemas.openxmlformats.org/officeDocument/2006/math" xmlns:v="urn:schemas-microsoft-com:vml" xmlns:wp14="http://schemas.microsoft.com/office/word/2010/wordprocessingDrawing" xmlns:wp="http://schemas.openxmlformats.org/drawingml/2006/wordprocessingDrawing" xmlns:w10="urn:schemas-microsoft-com:office:word" xmlns:w="http://schemas.openxmlformats.org/wordprocessingml/2006/main" xmlns:w14="http://schemas.microsoft.com/office/word/2010/wordml" xmlns:w15="http://schemas.microsoft.com/office/word/2012/wordml" xmlns:w16cid="http://schemas.microsoft.com/office/word/2016/wordml/cid" xmlns:w16se="http://schemas.microsoft.com/office/word/2015/wordml/symex" xmlns:wpg="http://schemas.microsoft.com/office/word/2010/wordprocessingGroup" xmlns:wpi="http://schemas.microsoft.com/office/word/2010/wordprocessingInk" xmlns:wne="http://schemas.microsoft.com/office/word/2006/wordml" xmlns:wps="http://schemas.microsoft.com/office/word/2010/wordprocessingShape" mc:Ignorable="w14 w15 w16se w16cid wp14">
+<w:footnotes xmlns:wpc="http://schemas.microsoft.com/office/word/2010/wordprocessingCanvas" xmlns:cx="http://schemas.microsoft.com/office/drawing/2014/chartex" xmlns:cx1="http://schemas.microsoft.com/office/drawing/2015/9/8/chartex" xmlns:cx2="http://schemas.microsoft.com/office/drawing/2015/10/21/chartex" xmlns:cx3="http://schemas.microsoft.com/office/drawing/2016/5/9/chartex" xmlns:cx4="http://schemas.microsoft.com/office/drawing/2016/5/10/chartex" xmlns:cx5="http://schemas.microsoft.com/office/drawing/2016/5/11/chartex" xmlns:cx6="http://schemas.microsoft.com/office/drawing/2016/5/12/chartex" xmlns:cx7="http://schemas.microsoft.com/office/drawing/2016/5/13/chartex" xmlns:cx8="http://schemas.microsoft.com/office/drawing/2016/5/14/chartex" xmlns:mc="http://schemas.openxmlformats.org/markup-compatibility/2006" xmlns:aink="http://schemas.microsoft.com/office/drawing/2016/ink" xmlns:am3d="http://schemas.microsoft.com/office/drawing/2017/model3d" xmlns:o="urn:schemas-microsoft-com:office:office" xmlns:r="http://schemas.openxmlformats.org/officeDocument/2006/relationships" xmlns:m="http://schemas.openxmlformats.org/officeDocument/2006/math" xmlns:v="urn:schemas-microsoft-com:vml" xmlns:wp14="http://schemas.microsoft.com/office/word/2010/wordprocessingDrawing" xmlns:wp="http://schemas.openxmlformats.org/drawingml/2006/wordprocessingDrawing" xmlns:w10="urn:schemas-microsoft-com:office:word" xmlns:w="http://schemas.openxmlformats.org/wordprocessingml/2006/main" xmlns:w14="http://schemas.microsoft.com/office/word/2010/wordml" xmlns:w15="http://schemas.microsoft.com/office/word/2012/wordml" xmlns:w16cex="http://schemas.microsoft.com/office/word/2018/wordml/cex" xmlns:w16cid="http://schemas.microsoft.com/office/word/2016/wordml/cid" xmlns:w16="http://schemas.microsoft.com/office/word/2018/wordml" xmlns:w16sdtdh="http://schemas.microsoft.com/office/word/2020/wordml/sdtdatahash" xmlns:w16se="http://schemas.microsoft.com/office/word/2015/wordml/symex" xmlns:wpg="http://schemas.microsoft.com/office/word/2010/wordprocessingGroup" xmlns:wpi="http://schemas.microsoft.com/office/word/2010/wordprocessingInk" xmlns:wne="http://schemas.microsoft.com/office/word/2006/wordml" xmlns:wps="http://schemas.microsoft.com/office/word/2010/wordprocessingShape" mc:Ignorable="w14 w15 w16se w16cid w16 w16cex w16sdtdh wp14">
   <w:footnote w:type="separator" w:id="-1">
     <w:p>
       <w:r>
@@ -3360,7 +3612,7 @@
 </file>
 
 <file path=word/header1.xml><?xml version="1.0" encoding="utf-8"?>
-<w:hdr xmlns:wpc="http://schemas.microsoft.com/office/word/2010/wordprocessingCanvas" xmlns:cx="http://schemas.microsoft.com/office/drawing/2014/chartex" xmlns:cx1="http://schemas.microsoft.com/office/drawing/2015/9/8/chartex" xmlns:cx2="http://schemas.microsoft.com/office/drawing/2015/10/21/chartex" xmlns:cx3="http://schemas.microsoft.com/office/drawing/2016/5/9/chartex" xmlns:cx4="http://schemas.microsoft.com/office/drawing/2016/5/10/chartex" xmlns:cx5="http://schemas.microsoft.com/office/drawing/2016/5/11/chartex" xmlns:cx6="http://schemas.microsoft.com/office/drawing/2016/5/12/chartex" xmlns:cx7="http://schemas.microsoft.com/office/drawing/2016/5/13/chartex" xmlns:cx8="http://schemas.microsoft.com/office/drawing/2016/5/14/chartex" xmlns:mc="http://schemas.openxmlformats.org/markup-compatibility/2006" xmlns:aink="http://schemas.microsoft.com/office/drawing/2016/ink" xmlns:am3d="http://schemas.microsoft.com/office/drawing/2017/model3d" xmlns:o="urn:schemas-microsoft-com:office:office" xmlns:r="http://schemas.openxmlformats.org/officeDocument/2006/relationships" xmlns:m="http://schemas.openxmlformats.org/officeDocument/2006/math" xmlns:v="urn:schemas-microsoft-com:vml" xmlns:wp14="http://schemas.microsoft.com/office/word/2010/wordprocessingDrawing" xmlns:wp="http://schemas.openxmlformats.org/drawingml/2006/wordprocessingDrawing" xmlns:w10="urn:schemas-microsoft-com:office:word" xmlns:w="http://schemas.openxmlformats.org/wordprocessingml/2006/main" xmlns:w14="http://schemas.microsoft.com/office/word/2010/wordml" xmlns:w15="http://schemas.microsoft.com/office/word/2012/wordml" xmlns:w16cid="http://schemas.microsoft.com/office/word/2016/wordml/cid" xmlns:w16se="http://schemas.microsoft.com/office/word/2015/wordml/symex" xmlns:wpg="http://schemas.microsoft.com/office/word/2010/wordprocessingGroup" xmlns:wpi="http://schemas.microsoft.com/office/word/2010/wordprocessingInk" xmlns:wne="http://schemas.microsoft.com/office/word/2006/wordml" xmlns:wps="http://schemas.microsoft.com/office/word/2010/wordprocessingShape" mc:Ignorable="w14 w15 w16se w16cid wp14">
+<w:hdr xmlns:wpc="http://schemas.microsoft.com/office/word/2010/wordprocessingCanvas" xmlns:cx="http://schemas.microsoft.com/office/drawing/2014/chartex" xmlns:cx1="http://schemas.microsoft.com/office/drawing/2015/9/8/chartex" xmlns:cx2="http://schemas.microsoft.com/office/drawing/2015/10/21/chartex" xmlns:cx3="http://schemas.microsoft.com/office/drawing/2016/5/9/chartex" xmlns:cx4="http://schemas.microsoft.com/office/drawing/2016/5/10/chartex" xmlns:cx5="http://schemas.microsoft.com/office/drawing/2016/5/11/chartex" xmlns:cx6="http://schemas.microsoft.com/office/drawing/2016/5/12/chartex" xmlns:cx7="http://schemas.microsoft.com/office/drawing/2016/5/13/chartex" xmlns:cx8="http://schemas.microsoft.com/office/drawing/2016/5/14/chartex" xmlns:mc="http://schemas.openxmlformats.org/markup-compatibility/2006" xmlns:aink="http://schemas.microsoft.com/office/drawing/2016/ink" xmlns:am3d="http://schemas.microsoft.com/office/drawing/2017/model3d" xmlns:o="urn:schemas-microsoft-com:office:office" xmlns:r="http://schemas.openxmlformats.org/officeDocument/2006/relationships" xmlns:m="http://schemas.openxmlformats.org/officeDocument/2006/math" xmlns:v="urn:schemas-microsoft-com:vml" xmlns:wp14="http://schemas.microsoft.com/office/word/2010/wordprocessingDrawing" xmlns:wp="http://schemas.openxmlformats.org/drawingml/2006/wordprocessingDrawing" xmlns:w10="urn:schemas-microsoft-com:office:word" xmlns:w="http://schemas.openxmlformats.org/wordprocessingml/2006/main" xmlns:w14="http://schemas.microsoft.com/office/word/2010/wordml" xmlns:w15="http://schemas.microsoft.com/office/word/2012/wordml" xmlns:w16cex="http://schemas.microsoft.com/office/word/2018/wordml/cex" xmlns:w16cid="http://schemas.microsoft.com/office/word/2016/wordml/cid" xmlns:w16="http://schemas.microsoft.com/office/word/2018/wordml" xmlns:w16sdtdh="http://schemas.microsoft.com/office/word/2020/wordml/sdtdatahash" xmlns:w16se="http://schemas.microsoft.com/office/word/2015/wordml/symex" xmlns:wpg="http://schemas.microsoft.com/office/word/2010/wordprocessingGroup" xmlns:wpi="http://schemas.microsoft.com/office/word/2010/wordprocessingInk" xmlns:wne="http://schemas.microsoft.com/office/word/2006/wordml" xmlns:wps="http://schemas.microsoft.com/office/word/2010/wordprocessingShape" mc:Ignorable="w14 w15 w16se w16cid w16 w16cex w16sdtdh wp14">
   <w:p>
     <w:r>
       <w:cr/>
@@ -3370,7 +3622,7 @@
 </file>
 
 <file path=word/numbering.xml><?xml version="1.0" encoding="utf-8"?>
-<w:numbering xmlns:wpc="http://schemas.microsoft.com/office/word/2010/wordprocessingCanvas" xmlns:cx="http://schemas.microsoft.com/office/drawing/2014/chartex" xmlns:cx1="http://schemas.microsoft.com/office/drawing/2015/9/8/chartex" xmlns:cx2="http://schemas.microsoft.com/office/drawing/2015/10/21/chartex" xmlns:cx3="http://schemas.microsoft.com/office/drawing/2016/5/9/chartex" xmlns:cx4="http://schemas.microsoft.com/office/drawing/2016/5/10/chartex" xmlns:cx5="http://schemas.microsoft.com/office/drawing/2016/5/11/chartex" xmlns:cx6="http://schemas.microsoft.com/office/drawing/2016/5/12/chartex" xmlns:cx7="http://schemas.microsoft.com/office/drawing/2016/5/13/chartex" xmlns:cx8="http://schemas.microsoft.com/office/drawing/2016/5/14/chartex" xmlns:mc="http://schemas.openxmlformats.org/markup-compatibility/2006" xmlns:aink="http://schemas.microsoft.com/office/drawing/2016/ink" xmlns:am3d="http://schemas.microsoft.com/office/drawing/2017/model3d" xmlns:o="urn:schemas-microsoft-com:office:office" xmlns:r="http://schemas.openxmlformats.org/officeDocument/2006/relationships" xmlns:m="http://schemas.openxmlformats.org/officeDocument/2006/math" xmlns:v="urn:schemas-microsoft-com:vml" xmlns:wp14="http://schemas.microsoft.com/office/word/2010/wordprocessingDrawing" xmlns:wp="http://schemas.openxmlformats.org/drawingml/2006/wordprocessingDrawing" xmlns:w10="urn:schemas-microsoft-com:office:word" xmlns:w="http://schemas.openxmlformats.org/wordprocessingml/2006/main" xmlns:w14="http://schemas.microsoft.com/office/word/2010/wordml" xmlns:w15="http://schemas.microsoft.com/office/word/2012/wordml" xmlns:w16cid="http://schemas.microsoft.com/office/word/2016/wordml/cid" xmlns:w16se="http://schemas.microsoft.com/office/word/2015/wordml/symex" xmlns:wpg="http://schemas.microsoft.com/office/word/2010/wordprocessingGroup" xmlns:wpi="http://schemas.microsoft.com/office/word/2010/wordprocessingInk" xmlns:wne="http://schemas.microsoft.com/office/word/2006/wordml" xmlns:wps="http://schemas.microsoft.com/office/word/2010/wordprocessingShape" mc:Ignorable="w14 w15 w16se w16cid wp14">
+<w:numbering xmlns:wpc="http://schemas.microsoft.com/office/word/2010/wordprocessingCanvas" xmlns:cx="http://schemas.microsoft.com/office/drawing/2014/chartex" xmlns:cx1="http://schemas.microsoft.com/office/drawing/2015/9/8/chartex" xmlns:cx2="http://schemas.microsoft.com/office/drawing/2015/10/21/chartex" xmlns:cx3="http://schemas.microsoft.com/office/drawing/2016/5/9/chartex" xmlns:cx4="http://schemas.microsoft.com/office/drawing/2016/5/10/chartex" xmlns:cx5="http://schemas.microsoft.com/office/drawing/2016/5/11/chartex" xmlns:cx6="http://schemas.microsoft.com/office/drawing/2016/5/12/chartex" xmlns:cx7="http://schemas.microsoft.com/office/drawing/2016/5/13/chartex" xmlns:cx8="http://schemas.microsoft.com/office/drawing/2016/5/14/chartex" xmlns:mc="http://schemas.openxmlformats.org/markup-compatibility/2006" xmlns:aink="http://schemas.microsoft.com/office/drawing/2016/ink" xmlns:am3d="http://schemas.microsoft.com/office/drawing/2017/model3d" xmlns:o="urn:schemas-microsoft-com:office:office" xmlns:r="http://schemas.openxmlformats.org/officeDocument/2006/relationships" xmlns:m="http://schemas.openxmlformats.org/officeDocument/2006/math" xmlns:v="urn:schemas-microsoft-com:vml" xmlns:wp14="http://schemas.microsoft.com/office/word/2010/wordprocessingDrawing" xmlns:wp="http://schemas.openxmlformats.org/drawingml/2006/wordprocessingDrawing" xmlns:w10="urn:schemas-microsoft-com:office:word" xmlns:w="http://schemas.openxmlformats.org/wordprocessingml/2006/main" xmlns:w14="http://schemas.microsoft.com/office/word/2010/wordml" xmlns:w15="http://schemas.microsoft.com/office/word/2012/wordml" xmlns:w16cex="http://schemas.microsoft.com/office/word/2018/wordml/cex" xmlns:w16cid="http://schemas.microsoft.com/office/word/2016/wordml/cid" xmlns:w16="http://schemas.microsoft.com/office/word/2018/wordml" xmlns:w16sdtdh="http://schemas.microsoft.com/office/word/2020/wordml/sdtdatahash" xmlns:w16se="http://schemas.microsoft.com/office/word/2015/wordml/symex" xmlns:wpg="http://schemas.microsoft.com/office/word/2010/wordprocessingGroup" xmlns:wpi="http://schemas.microsoft.com/office/word/2010/wordprocessingInk" xmlns:wne="http://schemas.microsoft.com/office/word/2006/wordml" xmlns:wps="http://schemas.microsoft.com/office/word/2010/wordprocessingShape" mc:Ignorable="w14 w15 w16se w16cid w16 w16cex w16sdtdh wp14">
   <w:abstractNum w:abstractNumId="0" w15:restartNumberingAfterBreak="0">
     <w:nsid w:val="4C7F5C81"/>
     <w:multiLevelType w:val="hybridMultilevel"/>
@@ -3467,7 +3719,7 @@
 </file>
 
 <file path=word/styles.xml><?xml version="1.0" encoding="utf-8"?>
-<w:styles xmlns:mc="http://schemas.openxmlformats.org/markup-compatibility/2006" xmlns:r="http://schemas.openxmlformats.org/officeDocument/2006/relationships" xmlns:w="http://schemas.openxmlformats.org/wordprocessingml/2006/main" xmlns:w14="http://schemas.microsoft.com/office/word/2010/wordml" xmlns:w15="http://schemas.microsoft.com/office/word/2012/wordml" xmlns:w16cid="http://schemas.microsoft.com/office/word/2016/wordml/cid" xmlns:w16se="http://schemas.microsoft.com/office/word/2015/wordml/symex" mc:Ignorable="w14 w15 w16se w16cid">
+<w:styles xmlns:mc="http://schemas.openxmlformats.org/markup-compatibility/2006" xmlns:r="http://schemas.openxmlformats.org/officeDocument/2006/relationships" xmlns:w="http://schemas.openxmlformats.org/wordprocessingml/2006/main" xmlns:w14="http://schemas.microsoft.com/office/word/2010/wordml" xmlns:w15="http://schemas.microsoft.com/office/word/2012/wordml" xmlns:w16cex="http://schemas.microsoft.com/office/word/2018/wordml/cex" xmlns:w16cid="http://schemas.microsoft.com/office/word/2016/wordml/cid" xmlns:w16="http://schemas.microsoft.com/office/word/2018/wordml" xmlns:w16sdtdh="http://schemas.microsoft.com/office/word/2020/wordml/sdtdatahash" xmlns:w16se="http://schemas.microsoft.com/office/word/2015/wordml/symex" mc:Ignorable="w14 w15 w16se w16cid w16 w16cex w16sdtdh">
   <w:docDefaults>
     <w:rPrDefault>
       <w:rPr>
@@ -3477,7 +3729,7 @@
     </w:rPrDefault>
     <w:pPrDefault/>
   </w:docDefaults>
-  <w:latentStyles w:defLockedState="0" w:defUIPriority="99" w:defSemiHidden="0" w:defUnhideWhenUsed="0" w:defQFormat="0" w:count="375">
+  <w:latentStyles w:defLockedState="0" w:defUIPriority="99" w:defSemiHidden="0" w:defUnhideWhenUsed="0" w:defQFormat="0" w:count="376">
     <w:lsdException w:name="Normal" w:uiPriority="0" w:qFormat="1"/>
     <w:lsdException w:name="heading 1" w:uiPriority="9" w:qFormat="1"/>
     <w:lsdException w:name="heading 2" w:semiHidden="1" w:uiPriority="9" w:unhideWhenUsed="1" w:qFormat="1"/>
@@ -3583,7 +3835,6 @@
     <w:lsdException w:name="HTML Sample" w:semiHidden="1" w:unhideWhenUsed="1"/>
     <w:lsdException w:name="HTML Typewriter" w:semiHidden="1" w:unhideWhenUsed="1"/>
     <w:lsdException w:name="HTML Variable" w:semiHidden="1" w:unhideWhenUsed="1"/>
-    <w:lsdException w:name="Normal Table" w:semiHidden="1" w:unhideWhenUsed="1"/>
     <w:lsdException w:name="annotation subject" w:semiHidden="1" w:unhideWhenUsed="1"/>
     <w:lsdException w:name="No List" w:semiHidden="1" w:unhideWhenUsed="1"/>
     <w:lsdException w:name="Outline List 1" w:semiHidden="1" w:unhideWhenUsed="1"/>
@@ -3630,10 +3881,8 @@
     <w:lsdException w:name="Table Subtle 2" w:semiHidden="1" w:unhideWhenUsed="1"/>
     <w:lsdException w:name="Table Web 1" w:semiHidden="1" w:unhideWhenUsed="1"/>
     <w:lsdException w:name="Table Web 2" w:semiHidden="1" w:unhideWhenUsed="1"/>
-    <w:lsdException w:name="Table Web 3" w:semiHidden="1" w:unhideWhenUsed="1"/>
     <w:lsdException w:name="Balloon Text" w:semiHidden="1" w:unhideWhenUsed="1"/>
     <w:lsdException w:name="Table Grid" w:uiPriority="39"/>
-    <w:lsdException w:name="Table Theme" w:semiHidden="1" w:unhideWhenUsed="1"/>
     <w:lsdException w:name="Placeholder Text" w:semiHidden="1"/>
     <w:lsdException w:name="No Spacing" w:uiPriority="1" w:qFormat="1"/>
     <w:lsdException w:name="Light Shading" w:uiPriority="60"/>
@@ -3853,6 +4102,7 @@
     <w:lsdException w:name="Smart Hyperlink" w:semiHidden="1" w:unhideWhenUsed="1"/>
     <w:lsdException w:name="Hashtag" w:semiHidden="1" w:unhideWhenUsed="1"/>
     <w:lsdException w:name="Unresolved Mention" w:semiHidden="1" w:unhideWhenUsed="1"/>
+    <w:lsdException w:name="Smart Link" w:semiHidden="1" w:unhideWhenUsed="1"/>
   </w:latentStyles>
   <w:style w:type="paragraph" w:default="1" w:styleId="Normal">
     <w:name w:val="Normal"/>

</xml_diff>